<commit_message>
updating my portofolio website
</commit_message>
<xml_diff>
--- a/assets/Adharsh Shokkalingam Resume.docx
+++ b/assets/Adharsh Shokkalingam Resume.docx
@@ -183,7 +183,25 @@
               <w:rPr>
                 <w:rFonts w:ascii="Times New Roman" w:hAnsi="Times New Roman"/>
               </w:rPr>
-              <w:t>4045 Alexander Way SW Edmonton, Alberta, T6W 2C6</w:t>
+              <w:t xml:space="preserve">4045 Alexander Way SW Edmonton, </w:t>
+            </w:r>
+            <w:r>
+              <w:rPr>
+                <w:rFonts w:ascii="Times New Roman" w:hAnsi="Times New Roman"/>
+              </w:rPr>
+              <w:t>Alberta,</w:t>
+            </w:r>
+            <w:r>
+              <w:rPr>
+                <w:rFonts w:ascii="Times New Roman" w:hAnsi="Times New Roman"/>
+              </w:rPr>
+              <w:t xml:space="preserve"> CA </w:t>
+            </w:r>
+            <w:r>
+              <w:rPr>
+                <w:rFonts w:ascii="Times New Roman" w:hAnsi="Times New Roman"/>
+              </w:rPr>
+              <w:t>T6W2C6</w:t>
             </w:r>
             <w:r>
               <w:rPr>
@@ -427,34 +445,6 @@
                 <w:rFonts w:ascii="Times New Roman" w:hAnsi="Times New Roman"/>
                 <w:color w:val="000000"/>
               </w:rPr>
-              <w:t>Ordinary</w:t>
-            </w:r>
-            <w:r>
-              <w:rPr>
-                <w:rFonts w:ascii="Times New Roman" w:hAnsi="Times New Roman"/>
-                <w:color w:val="000000"/>
-              </w:rPr>
-              <w:t xml:space="preserve"> </w:t>
-            </w:r>
-            <w:r>
-              <w:rPr>
-                <w:rFonts w:ascii="Times New Roman" w:hAnsi="Times New Roman"/>
-                <w:color w:val="000000"/>
-              </w:rPr>
-              <w:t>Differential</w:t>
-            </w:r>
-            <w:r>
-              <w:rPr>
-                <w:rFonts w:ascii="Times New Roman" w:hAnsi="Times New Roman"/>
-                <w:color w:val="000000"/>
-              </w:rPr>
-              <w:t xml:space="preserve"> Equations, </w:t>
-            </w:r>
-            <w:r>
-              <w:rPr>
-                <w:rFonts w:ascii="Times New Roman" w:hAnsi="Times New Roman"/>
-                <w:color w:val="000000"/>
-              </w:rPr>
               <w:t>Calculus</w:t>
             </w:r>
             <w:r>
@@ -724,14 +714,35 @@
                 <w:rFonts w:ascii="Times New Roman" w:hAnsi="Times New Roman"/>
                 <w:i/>
               </w:rPr>
-              <w:t xml:space="preserve">                                                                                                                           </w:t>
-            </w:r>
-            <w:r>
-              <w:rPr>
-                <w:rFonts w:ascii="Times New Roman" w:hAnsi="Times New Roman"/>
-                <w:i/>
-              </w:rPr>
-              <w:t>May 20</w:t>
+              <w:t xml:space="preserve">                                                                                                                        </w:t>
+            </w:r>
+            <w:r>
+              <w:rPr>
+                <w:rFonts w:ascii="Times New Roman" w:hAnsi="Times New Roman"/>
+                <w:i/>
+              </w:rPr>
+              <w:t xml:space="preserve"> </w:t>
+            </w:r>
+            <w:r>
+              <w:rPr>
+                <w:rFonts w:ascii="Times New Roman" w:hAnsi="Times New Roman"/>
+                <w:i/>
+              </w:rPr>
+              <w:t xml:space="preserve"> </w:t>
+            </w:r>
+            <w:r>
+              <w:rPr>
+                <w:rFonts w:ascii="Times New Roman" w:hAnsi="Times New Roman"/>
+                <w:i/>
+              </w:rPr>
+              <w:t>June</w:t>
+            </w:r>
+            <w:r>
+              <w:rPr>
+                <w:rFonts w:ascii="Times New Roman" w:hAnsi="Times New Roman"/>
+                <w:i/>
+              </w:rPr>
+              <w:t xml:space="preserve"> 20</w:t>
             </w:r>
             <w:r>
               <w:rPr>
@@ -822,23 +833,7 @@
                 <w:rFonts w:ascii="Times New Roman" w:hAnsi="Times New Roman"/>
                 <w:color w:val="000000"/>
               </w:rPr>
-              <w:t xml:space="preserve">Interfacing across embedded hardware and software sub teams in an </w:t>
-            </w:r>
-            <w:proofErr w:type="gramStart"/>
-            <w:r>
-              <w:rPr>
-                <w:rFonts w:ascii="Times New Roman" w:hAnsi="Times New Roman"/>
-                <w:color w:val="000000"/>
-              </w:rPr>
-              <w:t>open source</w:t>
-            </w:r>
-            <w:proofErr w:type="gramEnd"/>
-            <w:r>
-              <w:rPr>
-                <w:rFonts w:ascii="Times New Roman" w:hAnsi="Times New Roman"/>
-                <w:color w:val="000000"/>
-              </w:rPr>
-              <w:t xml:space="preserve"> satellite codebase to integrate and validate mission</w:t>
+              <w:t>Interfacing across embedded hardware and software sub teams in an open source satellite codebase to integrate and validate mission</w:t>
             </w:r>
             <w:r>
               <w:rPr>
@@ -1989,7 +1984,6 @@
               </w:tabs>
               <w:rPr>
                 <w:rFonts w:ascii="Times New Roman" w:hAnsi="Times New Roman"/>
-                <w:b/>
               </w:rPr>
             </w:pPr>
             <w:r>
@@ -2001,31 +1995,58 @@
                 <w:iCs/>
                 <w:color w:val="000000"/>
               </w:rPr>
-              <w:t xml:space="preserve">Health Monitor - </w:t>
-            </w:r>
-            <w:r>
-              <w:rPr>
-                <w:rFonts w:ascii="Times New Roman" w:hAnsi="Times New Roman"/>
-              </w:rPr>
-              <w:t xml:space="preserve">ESP32-S3, C++, FreeRTOS, LVGL </w:t>
-            </w:r>
-            <w:r>
-              <w:rPr>
-                <w:rFonts w:ascii="Times New Roman" w:hAnsi="Times New Roman"/>
-              </w:rPr>
-              <w:t>(IP)</w:t>
-            </w:r>
-            <w:r>
-              <w:rPr>
-                <w:rFonts w:ascii="Times New Roman" w:hAnsi="Times New Roman"/>
-              </w:rPr>
-              <w:t xml:space="preserve">                                                                              </w:t>
-            </w:r>
-            <w:r>
-              <w:rPr>
-                <w:rFonts w:ascii="Times New Roman" w:hAnsi="Times New Roman"/>
+              <w:t>Rust OS</w:t>
+            </w:r>
+            <w:r>
+              <w:rPr>
+                <w:rFonts w:ascii="Times New Roman" w:hAnsi="Times New Roman"/>
+                <w:b/>
+                <w:bCs/>
+                <w:i/>
+                <w:iCs/>
+                <w:color w:val="000000"/>
               </w:rPr>
               <w:t xml:space="preserve"> </w:t>
+            </w:r>
+            <w:r>
+              <w:rPr>
+                <w:rFonts w:ascii="Times New Roman" w:hAnsi="Times New Roman"/>
+                <w:b/>
+                <w:bCs/>
+                <w:i/>
+                <w:iCs/>
+                <w:color w:val="000000"/>
+              </w:rPr>
+              <w:t>–</w:t>
+            </w:r>
+            <w:r>
+              <w:rPr>
+                <w:rFonts w:ascii="Times New Roman" w:hAnsi="Times New Roman"/>
+                <w:b/>
+                <w:bCs/>
+                <w:i/>
+                <w:iCs/>
+                <w:color w:val="000000"/>
+              </w:rPr>
+              <w:t xml:space="preserve"> </w:t>
+            </w:r>
+            <w:r>
+              <w:rPr>
+                <w:rFonts w:ascii="Times New Roman" w:hAnsi="Times New Roman"/>
+              </w:rPr>
+              <w:t>RUST</w:t>
+            </w:r>
+            <w:r>
+              <w:rPr>
+                <w:rFonts w:ascii="Times New Roman" w:hAnsi="Times New Roman"/>
+              </w:rPr>
+              <w:t>, QEMU</w:t>
+            </w:r>
+            <w:r>
+              <w:rPr>
+                <w:rFonts w:ascii="Times New Roman" w:hAnsi="Times New Roman"/>
+              </w:rPr>
+              <w:t xml:space="preserve">                                                                                                                                   </w:t>
             </w:r>
             <w:r>
               <w:rPr>
@@ -2079,165 +2100,6 @@
               <w:rPr>
                 <w:rFonts w:ascii="Times New Roman" w:hAnsi="Times New Roman"/>
               </w:rPr>
-              <w:t>Buil</w:t>
-            </w:r>
-            <w:r>
-              <w:rPr>
-                <w:rFonts w:ascii="Times New Roman" w:hAnsi="Times New Roman"/>
-              </w:rPr>
-              <w:t>ding</w:t>
-            </w:r>
-            <w:r>
-              <w:rPr>
-                <w:rFonts w:ascii="Times New Roman" w:hAnsi="Times New Roman"/>
-              </w:rPr>
-              <w:t xml:space="preserve"> a wrist worn health monitor integrating a MAX30102 optical biosensor for real</w:t>
-            </w:r>
-            <w:r>
-              <w:rPr>
-                <w:rFonts w:ascii="Times New Roman" w:hAnsi="Times New Roman"/>
-              </w:rPr>
-              <w:t xml:space="preserve"> </w:t>
-            </w:r>
-            <w:r>
-              <w:rPr>
-                <w:rFonts w:ascii="Times New Roman" w:hAnsi="Times New Roman"/>
-              </w:rPr>
-              <w:t>time heart rate and SpO2, a 6</w:t>
-            </w:r>
-            <w:r>
-              <w:rPr>
-                <w:rFonts w:ascii="Times New Roman" w:hAnsi="Times New Roman"/>
-              </w:rPr>
-              <w:t xml:space="preserve"> </w:t>
-            </w:r>
-            <w:r>
-              <w:rPr>
-                <w:rFonts w:ascii="Times New Roman" w:hAnsi="Times New Roman"/>
-              </w:rPr>
-              <w:t>axis IMU for step counting, and a live scrolling ECG display across dual FreeRTOS tasks on an ESP32-S3</w:t>
-            </w:r>
-            <w:r>
-              <w:rPr>
-                <w:rFonts w:ascii="Times New Roman" w:hAnsi="Times New Roman"/>
-                <w:color w:val="000000"/>
-              </w:rPr>
-              <w:t>.</w:t>
-            </w:r>
-          </w:p>
-          <w:p>
-            <w:pPr>
-              <w:pStyle w:val="NoSpacing1"/>
-              <w:tabs>
-                <w:tab w:val="right" w:pos="10556"/>
-              </w:tabs>
-              <w:rPr>
-                <w:rFonts w:ascii="Times New Roman" w:hAnsi="Times New Roman"/>
-                <w:b/>
-              </w:rPr>
-            </w:pPr>
-            <w:r>
-              <w:rPr>
-                <w:rFonts w:ascii="Times New Roman" w:hAnsi="Times New Roman"/>
-                <w:b/>
-                <w:bCs/>
-                <w:i/>
-                <w:iCs/>
-                <w:color w:val="000000"/>
-              </w:rPr>
-              <w:t>Rust OS</w:t>
-            </w:r>
-            <w:r>
-              <w:rPr>
-                <w:rFonts w:ascii="Times New Roman" w:hAnsi="Times New Roman"/>
-                <w:b/>
-                <w:bCs/>
-                <w:i/>
-                <w:iCs/>
-                <w:color w:val="000000"/>
-              </w:rPr>
-              <w:t xml:space="preserve"> </w:t>
-            </w:r>
-            <w:r>
-              <w:rPr>
-                <w:rFonts w:ascii="Times New Roman" w:hAnsi="Times New Roman"/>
-                <w:b/>
-                <w:bCs/>
-                <w:i/>
-                <w:iCs/>
-                <w:color w:val="000000"/>
-              </w:rPr>
-              <w:t>–</w:t>
-            </w:r>
-            <w:r>
-              <w:rPr>
-                <w:rFonts w:ascii="Times New Roman" w:hAnsi="Times New Roman"/>
-                <w:b/>
-                <w:bCs/>
-                <w:i/>
-                <w:iCs/>
-                <w:color w:val="000000"/>
-              </w:rPr>
-              <w:t xml:space="preserve"> </w:t>
-            </w:r>
-            <w:r>
-              <w:rPr>
-                <w:rFonts w:ascii="Times New Roman" w:hAnsi="Times New Roman"/>
-              </w:rPr>
-              <w:t xml:space="preserve">RUST                                                                                                                                                 </w:t>
-            </w:r>
-            <w:r>
-              <w:rPr>
-                <w:rFonts w:ascii="Times New Roman" w:eastAsia="Times New Roman" w:hAnsi="Times New Roman"/>
-                <w:bCs/>
-                <w:i/>
-                <w:iCs/>
-                <w:color w:val="000000"/>
-              </w:rPr>
-              <w:t xml:space="preserve">May 2026 </w:t>
-            </w:r>
-            <w:r>
-              <w:rPr>
-                <w:rFonts w:ascii="Times New Roman" w:hAnsi="Times New Roman"/>
-                <w:i/>
-                <w:iCs/>
-              </w:rPr>
-              <w:t xml:space="preserve">– </w:t>
-            </w:r>
-            <w:r>
-              <w:rPr>
-                <w:rFonts w:ascii="Times New Roman" w:eastAsia="Times New Roman" w:hAnsi="Times New Roman"/>
-                <w:bCs/>
-                <w:i/>
-                <w:iCs/>
-                <w:color w:val="000000"/>
-              </w:rPr>
-              <w:t>Current 2026</w:t>
-            </w:r>
-            <w:r>
-              <w:rPr>
-                <w:rFonts w:ascii="Times New Roman" w:hAnsi="Times New Roman"/>
-                <w:i/>
-              </w:rPr>
-              <w:t xml:space="preserve">   </w:t>
-            </w:r>
-          </w:p>
-          <w:p>
-            <w:pPr>
-              <w:pStyle w:val="NoSpacing1"/>
-              <w:numPr>
-                <w:ilvl w:val="0"/>
-                <w:numId w:val="1"/>
-              </w:numPr>
-              <w:rPr>
-                <w:rFonts w:ascii="Times New Roman" w:eastAsia="Times New Roman" w:hAnsi="Times New Roman"/>
-                <w:color w:val="000000"/>
-              </w:rPr>
-            </w:pPr>
-            <w:r>
-              <w:rPr>
-                <w:rFonts w:ascii="Times New Roman" w:hAnsi="Times New Roman"/>
-              </w:rPr>
               <w:t>Building a bare metal x86_64 OS kernel with custom IDT for CPU exceptions and hardware interrupt handling, multilevel paging for virtual memory, and a heap allocator supporting bump, linked list, and fixed size block strategies.</w:t>
             </w:r>
           </w:p>
@@ -2282,7 +2144,35 @@
                 <w:rFonts w:ascii="Times New Roman" w:hAnsi="Times New Roman"/>
                 <w:color w:val="000000"/>
               </w:rPr>
-              <w:t>Python, Java, C/C++, SPSS, RISC-V Assembly (RV32I), Rust, HTML, CSS</w:t>
+              <w:t>Python, Java, C/C++,</w:t>
+            </w:r>
+            <w:r>
+              <w:rPr>
+                <w:rFonts w:ascii="Times New Roman" w:hAnsi="Times New Roman"/>
+                <w:color w:val="000000"/>
+              </w:rPr>
+              <w:t xml:space="preserve"> </w:t>
+            </w:r>
+            <w:r>
+              <w:rPr>
+                <w:rFonts w:ascii="Times New Roman" w:hAnsi="Times New Roman"/>
+                <w:color w:val="000000"/>
+              </w:rPr>
+              <w:t>RISC-V Assembly (RV32I), Rust,</w:t>
+            </w:r>
+            <w:r>
+              <w:rPr>
+                <w:rFonts w:ascii="Times New Roman" w:hAnsi="Times New Roman"/>
+                <w:color w:val="000000"/>
+              </w:rPr>
+              <w:t xml:space="preserve"> SPSS,</w:t>
+            </w:r>
+            <w:r>
+              <w:rPr>
+                <w:rFonts w:ascii="Times New Roman" w:hAnsi="Times New Roman"/>
+                <w:color w:val="000000"/>
+              </w:rPr>
+              <w:t xml:space="preserve"> HTML, CSS</w:t>
             </w:r>
           </w:p>
           <w:p>

</xml_diff>